<commit_message>
Add architecture diagram image and embed it in the assessment form
Co-Authored-By: Claude Opus 5.5 <noreply@anthropic.com>
Claude-Session: https://claude.ai/code/session_01Shx7h9eh5NV5DeWWxMXpuH
</commit_message>
<xml_diff>
--- a/docs/security-assessment-request-form.docx
+++ b/docs/security-assessment-request-form.docx
@@ -2197,197 +2197,52 @@
         <w:t xml:space="preserve">۶. شمای معماری هدف ارزیابی</w:t>
       </w:r>
     </w:p>
-    <w:tbl>
-      <w:tblPr>
-        <w:bidiVisual/>
-        <w:tblW w:type="dxa" w:w="9906"/>
-        <w:tblBorders>
-          <w:top w:val="single" w:color="auto" w:sz="4"/>
-          <w:left w:val="single" w:color="auto" w:sz="4"/>
-          <w:bottom w:val="single" w:color="auto" w:sz="4"/>
-          <w:right w:val="single" w:color="auto" w:sz="4"/>
-          <w:insideH w:val="single" w:color="auto" w:sz="4"/>
-          <w:insideV w:val="single" w:color="auto" w:sz="4"/>
-        </w:tblBorders>
-      </w:tblPr>
-      <w:tblGrid>
-        <w:gridCol w:w="9906"/>
-      </w:tblGrid>
-      <w:tr>
-        <w:tc>
-          <w:tcPr>
-            <w:tcW w:type="dxa" w:w="9906"/>
-            <w:tcBorders>
-              <w:top w:val="single" w:color="808080" w:sz="4"/>
-              <w:left w:val="single" w:color="808080" w:sz="4"/>
-              <w:bottom w:val="single" w:color="808080" w:sz="4"/>
-              <w:right w:val="single" w:color="808080" w:sz="4"/>
-            </w:tcBorders>
-            <w:tcMar>
-              <w:top w:type="dxa" w:w="60"/>
-              <w:left w:type="dxa" w:w="100"/>
-              <w:bottom w:type="dxa" w:w="60"/>
-              <w:right w:type="dxa" w:w="100"/>
-            </w:tcMar>
-            <w:vAlign w:val="center"/>
-          </w:tcPr>
-          <w:p>
-            <w:pPr>
-              <w:spacing w:after="0" w:before="0"/>
-              <w:jc w:val="left"/>
-            </w:pPr>
-            <w:r>
-              <w:rPr>
-                <w:rFonts w:ascii="Consolas" w:cs="Consolas" w:eastAsia="Consolas" w:hAnsi="Consolas"/>
-                <w:sz w:val="17"/>
-                <w:szCs w:val="17"/>
-              </w:rPr>
-              <w:t xml:space="preserve">کاربر (مرورگر)  ── HTTP/HTTPS ──►  IIS / SharePoint Server 2019</w:t>
-            </w:r>
-          </w:p>
-          <w:p>
-            <w:pPr>
-              <w:spacing w:after="0" w:before="0"/>
-              <w:jc w:val="left"/>
-            </w:pPr>
-            <w:r>
-              <w:rPr>
-                <w:rFonts w:ascii="Consolas" w:cs="Consolas" w:eastAsia="Consolas" w:hAnsi="Consolas"/>
-                <w:sz w:val="17"/>
-                <w:szCs w:val="17"/>
-              </w:rPr>
-              <w:t xml:space="preserve">        (testlearn.shastangroup.ir  /  srv-shp-web)</w:t>
-            </w:r>
-          </w:p>
-          <w:p>
-            <w:pPr>
-              <w:spacing w:after="0" w:before="0"/>
-              <w:jc w:val="left"/>
-            </w:pPr>
-            <w:r>
-              <w:rPr>
-                <w:rFonts w:ascii="Consolas" w:cs="Consolas" w:eastAsia="Consolas" w:hAnsi="Consolas"/>
-                <w:sz w:val="17"/>
-                <w:szCs w:val="17"/>
-              </w:rPr>
-              <w:t xml:space="preserve">   ├─ KBPages: index · browse · content · register        (عمومی)</w:t>
-            </w:r>
-          </w:p>
-          <w:p>
-            <w:pPr>
-              <w:spacing w:after="0" w:before="0"/>
-              <w:jc w:val="left"/>
-            </w:pPr>
-            <w:r>
-              <w:rPr>
-                <w:rFonts w:ascii="Consolas" w:cs="Consolas" w:eastAsia="Consolas" w:hAnsi="Consolas"/>
-                <w:sz w:val="17"/>
-                <w:szCs w:val="17"/>
-              </w:rPr>
-              <w:t xml:space="preserve">   ├─ KBPanel/panel.aspx                                  (پنل مدیریت)</w:t>
-            </w:r>
-          </w:p>
-          <w:p>
-            <w:pPr>
-              <w:spacing w:after="0" w:before="0"/>
-              <w:jc w:val="left"/>
-            </w:pPr>
-            <w:r>
-              <w:rPr>
-                <w:rFonts w:ascii="Consolas" w:cs="Consolas" w:eastAsia="Consolas" w:hAnsi="Consolas"/>
-                <w:sz w:val="17"/>
-                <w:szCs w:val="17"/>
-              </w:rPr>
-              <w:t xml:space="preserve">   ├─ _layouts/15/KB/login.aspx                           (ورود Forms + LDAP)</w:t>
-            </w:r>
-          </w:p>
-          <w:p>
-            <w:pPr>
-              <w:spacing w:after="0" w:before="0"/>
-              <w:jc w:val="left"/>
-            </w:pPr>
-            <w:r>
-              <w:rPr>
-                <w:rFonts w:ascii="Consolas" w:cs="Consolas" w:eastAsia="Consolas" w:hAnsi="Consolas"/>
-                <w:sz w:val="17"/>
-                <w:szCs w:val="17"/>
-              </w:rPr>
-              <w:t xml:space="preserve">   ├─ _layouts/15/KB/KBApi.ashx                           (سرویس سمت سرور)</w:t>
-            </w:r>
-          </w:p>
-          <w:p>
-            <w:pPr>
-              <w:spacing w:after="0" w:before="0"/>
-              <w:jc w:val="left"/>
-            </w:pPr>
-            <w:r>
-              <w:rPr>
-                <w:rFonts w:ascii="Consolas" w:cs="Consolas" w:eastAsia="Consolas" w:hAnsi="Consolas"/>
-                <w:sz w:val="17"/>
-                <w:szCs w:val="17"/>
-              </w:rPr>
-              <w:t xml:space="preserve">   └─ KBAssets (css · js · fonts) · DocLib                (فایل‌های ایستا و رسانه)</w:t>
-            </w:r>
-          </w:p>
-          <w:p>
-            <w:pPr>
-              <w:spacing w:after="0" w:before="0"/>
-              <w:jc w:val="left"/>
-            </w:pPr>
-            <w:r>
-              <w:rPr>
-                <w:rFonts w:ascii="Consolas" w:cs="Consolas" w:eastAsia="Consolas" w:hAnsi="Consolas"/>
-                <w:sz w:val="17"/>
-                <w:szCs w:val="17"/>
-              </w:rPr>
-              <w:t xml:space="preserve">                         │</w:t>
-            </w:r>
-          </w:p>
-          <w:p>
-            <w:pPr>
-              <w:spacing w:after="0" w:before="0"/>
-              <w:jc w:val="left"/>
-            </w:pPr>
-            <w:r>
-              <w:rPr>
-                <w:rFonts w:ascii="Consolas" w:cs="Consolas" w:eastAsia="Consolas" w:hAnsi="Consolas"/>
-                <w:sz w:val="17"/>
-                <w:szCs w:val="17"/>
-              </w:rPr>
-              <w:t xml:space="preserve">      ┌──────────────────┼──────────────────┐</w:t>
-            </w:r>
-          </w:p>
-          <w:p>
-            <w:pPr>
-              <w:spacing w:after="0" w:before="0"/>
-              <w:jc w:val="left"/>
-            </w:pPr>
-            <w:r>
-              <w:rPr>
-                <w:rFonts w:ascii="Consolas" w:cs="Consolas" w:eastAsia="Consolas" w:hAnsi="Consolas"/>
-                <w:sz w:val="17"/>
-                <w:szCs w:val="17"/>
-              </w:rPr>
-              <w:t xml:space="preserve">  SQL Server        Active Directory        SMTP Server</w:t>
-            </w:r>
-          </w:p>
-          <w:p>
-            <w:pPr>
-              <w:spacing w:after="0" w:before="0"/>
-              <w:jc w:val="left"/>
-            </w:pPr>
-            <w:r>
-              <w:rPr>
-                <w:rFonts w:ascii="Consolas" w:cs="Consolas" w:eastAsia="Consolas" w:hAnsi="Consolas"/>
-                <w:sz w:val="17"/>
-                <w:szCs w:val="17"/>
-              </w:rPr>
-              <w:t xml:space="preserve"> (Content DB)    (LDAP / Kerberos)      (ایمیل اطلاع‌رسانی)</w:t>
-            </w:r>
-          </w:p>
-        </w:tc>
-      </w:tr>
-    </w:tbl>
+    <w:p>
+      <w:pPr>
+        <w:spacing w:after="80" w:before="80"/>
+        <w:jc w:val="center"/>
+      </w:pPr>
+      <w:r>
+        <w:drawing>
+          <wp:inline distT="0" distB="0" distL="0" distR="0">
+            <wp:extent cx="5619750" cy="3657600"/>
+            <wp:effectExtent t="0" r="0" b="0" l="0"/>
+            <wp:docPr id="1" name="architecture" descr="شمای معماری هدف ارزیابی" title="شمای معماری"/>
+            <wp:cNvGraphicFramePr>
+              <a:graphicFrameLocks xmlns:a="http://schemas.openxmlformats.org/drawingml/2006/main" noChangeAspect="1"/>
+            </wp:cNvGraphicFramePr>
+            <a:graphic xmlns:a="http://schemas.openxmlformats.org/drawingml/2006/main">
+              <a:graphicData uri="http://schemas.openxmlformats.org/drawingml/2006/picture">
+                <pic:pic xmlns:pic="http://schemas.openxmlformats.org/drawingml/2006/picture">
+                  <pic:nvPicPr>
+                    <pic:cNvPr id="0" name="" descr=""/>
+                    <pic:cNvPicPr>
+                      <a:picLocks noChangeAspect="1" noChangeArrowheads="1"/>
+                    </pic:cNvPicPr>
+                  </pic:nvPicPr>
+                  <pic:blipFill>
+                    <a:blip r:embed="rId8" cstate="none"/>
+                    <a:srcRect/>
+                    <a:stretch>
+                      <a:fillRect/>
+                    </a:stretch>
+                  </pic:blipFill>
+                  <pic:spPr bwMode="auto">
+                    <a:xfrm>
+                      <a:off x="0" y="0"/>
+                      <a:ext cx="5619750" cy="3657600"/>
+                    </a:xfrm>
+                    <a:prstGeom prst="rect">
+                      <a:avLst/>
+                    </a:prstGeom>
+                  </pic:spPr>
+                </pic:pic>
+              </a:graphicData>
+            </a:graphic>
+          </wp:inline>
+        </w:drawing>
+      </w:r>
+    </w:p>
     <w:p>
       <w:pPr>
         <w:pBdr>

</xml_diff>